<commit_message>
Hoja anual: jefe de unidad por defecto y tabla de mandos redimensionada
- Jefe de la unidad por defecto: D. Javier Arrabal Flores (sale en mayúsculas en la firma).
- Tabla de mandos del documento: cabeceras en negrita, filas a la altura de las
  biográficas y columnas de empleo/unidad más anchas; fechas en dd/mm/aa.
- En el formulario, los mandos se rellenan por fichas (titular, interino y
  accidental con calendario) en vez de una tabla de 8 columnas.
- Un ajuste guardado vacío vuelve a su valor por defecto.

Co-Authored-By: Claude Opus 5.5 <noreply@anthropic.com>
Claude-Session: https://claude.ai/code/session_01TrnA11zegVHodSKRrTkKtQ
</commit_message>
<xml_diff>
--- a/s1/plantillas/hoja_anual_servicios_corta.docx
+++ b/s1/plantillas/hoja_anual_servicios_corta.docx
@@ -820,8 +820,8 @@
         <w:tblLook w:firstColumn="1" w:firstRow="1" w:lastColumn="0" w:lastRow="0" w:noHBand="0" w:noVBand="1" w:val="04A0"/>
       </w:tblPr>
       <w:tblGrid>
-        <w:gridCol w:w="1360"/>
-        <w:gridCol w:w="2154"/>
+        <w:gridCol w:w="1247"/>
+        <w:gridCol w:w="2268"/>
         <w:gridCol w:w="1020"/>
         <w:gridCol w:w="1020"/>
         <w:gridCol w:w="1020"/>
@@ -831,13 +831,13 @@
       </w:tblGrid>
       <w:tr>
         <w:trPr>
-          <w:trHeight w:val="272" w:hRule="atLeast"/>
+          <w:trHeight w:val="283" w:hRule="atLeast"/>
           <w:cantSplit/>
           <w:tblHeader/>
         </w:trPr>
         <w:tc>
           <w:tcPr>
-            <w:tcW w:type="dxa" w:w="1361"/>
+            <w:tcW w:type="dxa" w:w="1247"/>
             <w:vMerge w:val="restart"/>
             <w:tcBorders>
               <w:top w:val="single" w:sz="4" w:space="0" w:color="000000"/>
@@ -849,20 +849,21 @@
           </w:tcPr>
           <w:p>
             <w:pPr>
-              <w:spacing w:after="0" w:line="210" w:lineRule="exact"/>
+              <w:spacing w:after="0" w:line="200" w:lineRule="exact"/>
               <w:jc w:val="center"/>
             </w:pPr>
             <w:r>
               <w:rPr>
-                <w:sz w:val="18"/>
+                <w:b/>
+                <w:sz w:val="17"/>
               </w:rPr>
-              <w:t>Empleo</w:t>
+              <w:t>EMPLEO</w:t>
             </w:r>
           </w:p>
         </w:tc>
         <w:tc>
           <w:tcPr>
-            <w:tcW w:type="dxa" w:w="2154"/>
+            <w:tcW w:type="dxa" w:w="2268"/>
             <w:vMerge w:val="restart"/>
             <w:tcBorders>
               <w:top w:val="single" w:sz="4" w:space="0" w:color="000000"/>
@@ -874,14 +875,15 @@
           </w:tcPr>
           <w:p>
             <w:pPr>
-              <w:spacing w:after="0" w:line="210" w:lineRule="exact"/>
+              <w:spacing w:after="0" w:line="200" w:lineRule="exact"/>
               <w:jc w:val="center"/>
             </w:pPr>
             <w:r>
               <w:rPr>
-                <w:sz w:val="18"/>
+                <w:b/>
+                <w:sz w:val="17"/>
               </w:rPr>
-              <w:t>Tipo de Unidad</w:t>
+              <w:t>TIPO DE UNIDAD</w:t>
             </w:r>
           </w:p>
         </w:tc>
@@ -899,27 +901,28 @@
           </w:tcPr>
           <w:p>
             <w:pPr>
-              <w:spacing w:after="0" w:line="210" w:lineRule="exact"/>
+              <w:spacing w:after="0" w:line="200" w:lineRule="exact"/>
               <w:jc w:val="center"/>
             </w:pPr>
             <w:r>
               <w:rPr>
-                <w:sz w:val="18"/>
+                <w:b/>
+                <w:sz w:val="17"/>
               </w:rPr>
-              <w:t>Tipo de Mando</w:t>
+              <w:t>TIPO DE MANDO</w:t>
             </w:r>
           </w:p>
         </w:tc>
       </w:tr>
       <w:tr>
         <w:trPr>
-          <w:trHeight w:val="272" w:hRule="atLeast"/>
+          <w:trHeight w:val="283" w:hRule="atLeast"/>
           <w:cantSplit/>
           <w:tblHeader/>
         </w:trPr>
         <w:tc>
           <w:tcPr>
-            <w:tcW w:type="dxa" w:w="1361"/>
+            <w:tcW w:type="dxa" w:w="1247"/>
             <w:vMerge/>
             <w:tcBorders>
               <w:top w:val="single" w:sz="4" w:space="0" w:color="000000"/>
@@ -937,7 +940,7 @@
         </w:tc>
         <w:tc>
           <w:tcPr>
-            <w:tcW w:type="dxa" w:w="2154"/>
+            <w:tcW w:type="dxa" w:w="2268"/>
             <w:vMerge/>
             <w:tcBorders>
               <w:top w:val="single" w:sz="4" w:space="0" w:color="000000"/>
@@ -967,14 +970,15 @@
           </w:tcPr>
           <w:p>
             <w:pPr>
-              <w:spacing w:after="0" w:line="210" w:lineRule="exact"/>
+              <w:spacing w:after="0" w:line="180" w:lineRule="exact"/>
               <w:jc w:val="center"/>
             </w:pPr>
             <w:r>
               <w:rPr>
-                <w:sz w:val="18"/>
+                <w:b/>
+                <w:sz w:val="16"/>
               </w:rPr>
-              <w:t>Titular</w:t>
+              <w:t>TITULAR</w:t>
             </w:r>
           </w:p>
         </w:tc>
@@ -992,14 +996,15 @@
           </w:tcPr>
           <w:p>
             <w:pPr>
-              <w:spacing w:after="0" w:line="210" w:lineRule="exact"/>
+              <w:spacing w:after="0" w:line="180" w:lineRule="exact"/>
               <w:jc w:val="center"/>
             </w:pPr>
             <w:r>
               <w:rPr>
-                <w:sz w:val="18"/>
+                <w:b/>
+                <w:sz w:val="16"/>
               </w:rPr>
-              <w:t>Interino</w:t>
+              <w:t>INTERINO</w:t>
             </w:r>
           </w:p>
         </w:tc>
@@ -1017,27 +1022,28 @@
           </w:tcPr>
           <w:p>
             <w:pPr>
-              <w:spacing w:after="0" w:line="210" w:lineRule="exact"/>
+              <w:spacing w:after="0" w:line="180" w:lineRule="exact"/>
               <w:jc w:val="center"/>
             </w:pPr>
             <w:r>
               <w:rPr>
-                <w:sz w:val="18"/>
+                <w:b/>
+                <w:sz w:val="16"/>
               </w:rPr>
-              <w:t>Acctal.</w:t>
+              <w:t>ACCTAL.</w:t>
             </w:r>
           </w:p>
         </w:tc>
       </w:tr>
       <w:tr>
         <w:trPr>
-          <w:trHeight w:val="272" w:hRule="atLeast"/>
+          <w:trHeight w:val="283" w:hRule="atLeast"/>
           <w:cantSplit/>
           <w:tblHeader/>
         </w:trPr>
         <w:tc>
           <w:tcPr>
-            <w:tcW w:type="dxa" w:w="1361"/>
+            <w:tcW w:type="dxa" w:w="1247"/>
             <w:vMerge/>
             <w:tcBorders>
               <w:top w:val="single" w:sz="4" w:space="0" w:color="000000"/>
@@ -1055,7 +1061,7 @@
         </w:tc>
         <w:tc>
           <w:tcPr>
-            <w:tcW w:type="dxa" w:w="2154"/>
+            <w:tcW w:type="dxa" w:w="2268"/>
             <w:vMerge/>
             <w:tcBorders>
               <w:top w:val="single" w:sz="4" w:space="0" w:color="000000"/>
@@ -1084,12 +1090,12 @@
           </w:tcPr>
           <w:p>
             <w:pPr>
-              <w:spacing w:after="0" w:line="210" w:lineRule="exact"/>
+              <w:spacing w:after="0" w:line="180" w:lineRule="exact"/>
               <w:jc w:val="center"/>
             </w:pPr>
             <w:r>
               <w:rPr>
-                <w:sz w:val="18"/>
+                <w:sz w:val="16"/>
               </w:rPr>
               <w:t>Inicio</w:t>
             </w:r>
@@ -1108,12 +1114,12 @@
           </w:tcPr>
           <w:p>
             <w:pPr>
-              <w:spacing w:after="0" w:line="210" w:lineRule="exact"/>
+              <w:spacing w:after="0" w:line="180" w:lineRule="exact"/>
               <w:jc w:val="center"/>
             </w:pPr>
             <w:r>
               <w:rPr>
-                <w:sz w:val="18"/>
+                <w:sz w:val="16"/>
               </w:rPr>
               <w:t>Fin</w:t>
             </w:r>
@@ -1132,12 +1138,12 @@
           </w:tcPr>
           <w:p>
             <w:pPr>
-              <w:spacing w:after="0" w:line="210" w:lineRule="exact"/>
+              <w:spacing w:after="0" w:line="180" w:lineRule="exact"/>
               <w:jc w:val="center"/>
             </w:pPr>
             <w:r>
               <w:rPr>
-                <w:sz w:val="18"/>
+                <w:sz w:val="16"/>
               </w:rPr>
               <w:t>Inicio</w:t>
             </w:r>
@@ -1156,12 +1162,12 @@
           </w:tcPr>
           <w:p>
             <w:pPr>
-              <w:spacing w:after="0" w:line="210" w:lineRule="exact"/>
+              <w:spacing w:after="0" w:line="180" w:lineRule="exact"/>
               <w:jc w:val="center"/>
             </w:pPr>
             <w:r>
               <w:rPr>
-                <w:sz w:val="18"/>
+                <w:sz w:val="16"/>
               </w:rPr>
               <w:t>Fin</w:t>
             </w:r>
@@ -1180,12 +1186,12 @@
           </w:tcPr>
           <w:p>
             <w:pPr>
-              <w:spacing w:after="0" w:line="210" w:lineRule="exact"/>
+              <w:spacing w:after="0" w:line="180" w:lineRule="exact"/>
               <w:jc w:val="center"/>
             </w:pPr>
             <w:r>
               <w:rPr>
-                <w:sz w:val="18"/>
+                <w:sz w:val="16"/>
               </w:rPr>
               <w:t>Inicio</w:t>
             </w:r>
@@ -1204,12 +1210,12 @@
           </w:tcPr>
           <w:p>
             <w:pPr>
-              <w:spacing w:after="0" w:line="210" w:lineRule="exact"/>
+              <w:spacing w:after="0" w:line="180" w:lineRule="exact"/>
               <w:jc w:val="center"/>
             </w:pPr>
             <w:r>
               <w:rPr>
-                <w:sz w:val="18"/>
+                <w:sz w:val="16"/>
               </w:rPr>
               <w:t>Fin</w:t>
             </w:r>
@@ -1218,12 +1224,12 @@
       </w:tr>
       <w:tr>
         <w:trPr>
-          <w:trHeight w:val="272" w:hRule="atLeast"/>
+          <w:trHeight w:val="317" w:hRule="atLeast"/>
           <w:cantSplit/>
         </w:trPr>
         <w:tc>
           <w:tcPr>
-            <w:tcW w:type="dxa" w:w="1361"/>
+            <w:tcW w:type="dxa" w:w="1247"/>
             <w:tcBorders>
               <w:top w:val="single" w:sz="4" w:space="0" w:color="000000"/>
               <w:left w:val="single" w:sz="4" w:space="0" w:color="000000"/>
@@ -1247,7 +1253,7 @@
         </w:tc>
         <w:tc>
           <w:tcPr>
-            <w:tcW w:type="dxa" w:w="2154"/>
+            <w:tcW w:type="dxa" w:w="2268"/>
             <w:tcBorders>
               <w:top w:val="single" w:sz="4" w:space="0" w:color="000000"/>
               <w:left w:val="single" w:sz="4" w:space="0" w:color="000000"/>
@@ -1507,7 +1513,7 @@
               <w:rPr>
                 <w:sz w:val="19"/>
               </w:rPr>
-              <w:t>{jefe_unidad}</w:t>
+              <w:t>{JEFE_UNIDAD}</w:t>
             </w:r>
           </w:p>
         </w:tc>

</xml_diff>